<commit_message>
List A: drop the Lancer's Sigil, reinvest into board control
The Sigil (and every Valourstrike enhancement) is a "buff a nearby Knight"
aura -- useless on a solo M14 Lancer that outruns the pack, and it can't
help its own charge. No self-buff is available (Dominus enhancements need a
2nd DOMINUS model; the only one wears Blessed Plate). So: Lancer runs clean,
and the freed 60 pts go into A's weakest axis -- a Helverin->Moirax swap
(Anti-Vehicle 2+ / Anti-Infantry 2+ Torrent / siege claw) + a Voidsmen-at-
Arms ally (OC2 board bodies). Now exactly 2000/2000. Regenerated the A doc.

Co-Authored-By: Claude Opus 4.8 (1M context) <noreply@anthropic.com>
</commit_message>
<xml_diff>
--- a/docs/Knights-A-Battle-Plan.docx
+++ b/docs/Knights-A-Battle-Plan.docx
@@ -59,7 +59,7 @@
           <w:b/>
           <w:i w:val="0"/>
         </w:rPr>
-        <w:t>Knights A - Lancer Aggressive (Purge the Foe)  —  1965/2000 pts  (Knight portion + validated Agents ally)</w:t>
+        <w:t>Knights A - Lancer Aggressive (Purge the Foe)  —  2000/2000 pts  (Knight portion + validated Agents ally)</w:t>
       </w:r>
     </w:p>
     <w:p>
@@ -107,7 +107,7 @@
         <w:rPr>
           <w:b w:val="0"/>
         </w:rPr>
-        <w:t xml:space="preserve">  440 pts  ·  Bearer of the Lancer's Sigil</w:t>
+        <w:t xml:space="preserve">  415 pts</w:t>
       </w:r>
     </w:p>
     <w:p>
@@ -155,13 +155,31 @@
         <w:rPr>
           <w:b/>
         </w:rPr>
-        <w:t>2x Armiger Helverin</w:t>
+        <w:t>Armiger Helverin</w:t>
       </w:r>
       <w:r>
         <w:rPr>
           <w:b w:val="0"/>
         </w:rPr>
-        <w:t xml:space="preserve">  280 pts</w:t>
+        <w:t xml:space="preserve">  140 pts</w:t>
+      </w:r>
+    </w:p>
+    <w:p>
+      <w:pPr>
+        <w:pStyle w:val="ListBullet"/>
+        <w:spacing w:after="40"/>
+      </w:pPr>
+      <w:r>
+        <w:rPr>
+          <w:b/>
+        </w:rPr>
+        <w:t>Armiger Moirax</w:t>
+      </w:r>
+      <w:r>
+        <w:rPr>
+          <w:b w:val="0"/>
+        </w:rPr>
+        <w:t xml:space="preserve">  150 pts</w:t>
       </w:r>
     </w:p>
     <w:p>
@@ -180,6 +198,24 @@
           <w:b w:val="0"/>
         </w:rPr>
         <w:t xml:space="preserve">  75 pts</w:t>
+      </w:r>
+    </w:p>
+    <w:p>
+      <w:pPr>
+        <w:pStyle w:val="ListBullet"/>
+        <w:spacing w:after="40"/>
+      </w:pPr>
+      <w:r>
+        <w:rPr>
+          <w:b/>
+        </w:rPr>
+        <w:t>Voidsmen-at-Arms (ally)</w:t>
+      </w:r>
+      <w:r>
+        <w:rPr>
+          <w:b w:val="0"/>
+        </w:rPr>
+        <w:t xml:space="preserve">  50 pts</w:t>
       </w:r>
     </w:p>
     <w:p>

</xml_diff>